<commit_message>
Changes to be committed: 	modified:   3.16a.py 	new file:   4.10a.py 	new file:   4.10bc.py 	new file:   4.11.py 	new file:   4.12.py 	new file:   4.13a.py 	new file:   4.13b.py 	new file:   4.13c.py 	new file:   4.14a.py 	new file:   4.14b.py 	new file:   4.14c.py 	new file:   4.14d.py 	new file:   4.7.py 	new file:   4.8a.py 	new file:   4.8b.py 	new file:   4.8c.py 	new file:   4.9a.py 	new file:   4.9b.py 	new file:   4preliminary.py 	modified:   Excercises.docx
</commit_message>
<xml_diff>
--- a/Excercises.docx
+++ b/Excercises.docx
@@ -2020,6 +2020,12 @@
     </w:p>
     <w:p>
       <w:pPr>
+        <w:pBdr>
+          <w:top w:val="single" w:sz="4" w:space="1" w:color="auto"/>
+          <w:left w:val="single" w:sz="4" w:space="4" w:color="auto"/>
+          <w:bottom w:val="single" w:sz="4" w:space="1" w:color="auto"/>
+          <w:right w:val="single" w:sz="4" w:space="4" w:color="auto"/>
+        </w:pBdr>
         <w:rPr>
           <w:b/>
           <w:bCs/>
@@ -2150,32 +2156,426 @@
           <w:lang w:val="en-GB"/>
         </w:rPr>
       </w:pPr>
-    </w:p>
-    <w:p>
-      <w:pPr>
-        <w:rPr>
-          <w:lang w:val="en-GB"/>
-        </w:rPr>
-      </w:pPr>
-    </w:p>
-    <w:p>
-      <w:pPr>
-        <w:rPr>
-          <w:lang w:val="en-GB"/>
-        </w:rPr>
-      </w:pPr>
-    </w:p>
-    <w:p>
-      <w:pPr>
-        <w:rPr>
-          <w:lang w:val="en-GB"/>
-        </w:rPr>
-      </w:pPr>
-    </w:p>
-    <w:p>
-      <w:pPr>
-        <w:rPr>
-          <w:lang w:val="en-GB"/>
+      <w:r>
+        <w:rPr>
+          <w:lang w:val="en-GB"/>
+        </w:rPr>
+        <w:t>4.1</w:t>
+      </w:r>
+      <w:r>
+        <w:rPr>
+          <w:lang w:val="en-GB"/>
+        </w:rPr>
+        <w:t xml:space="preserve">a </w:t>
+      </w:r>
+      <w:r>
+        <w:rPr>
+          <w:lang w:val="en-GB"/>
+        </w:rPr>
+        <w:t xml:space="preserve">2 </w:t>
+      </w:r>
+      <w:proofErr w:type="spellStart"/>
+      <w:r>
+        <w:rPr>
+          <w:lang w:val="en-GB"/>
+        </w:rPr>
+        <w:t>keer</w:t>
+      </w:r>
+      <w:proofErr w:type="spellEnd"/>
+      <w:r>
+        <w:rPr>
+          <w:lang w:val="en-GB"/>
+        </w:rPr>
+        <w:t xml:space="preserve"> </w:t>
+      </w:r>
+      <w:proofErr w:type="spellStart"/>
+      <w:r>
+        <w:rPr>
+          <w:lang w:val="en-GB"/>
+        </w:rPr>
+        <w:t>bla</w:t>
+      </w:r>
+      <w:proofErr w:type="spellEnd"/>
+      <w:r>
+        <w:rPr>
+          <w:lang w:val="en-GB"/>
+        </w:rPr>
+        <w:t>…</w:t>
+      </w:r>
+    </w:p>
+    <w:p>
+      <w:pPr>
+        <w:rPr>
+          <w:lang w:val="en-GB"/>
+        </w:rPr>
+      </w:pPr>
+      <w:r>
+        <w:rPr>
+          <w:lang w:val="en-GB"/>
+        </w:rPr>
+        <w:t xml:space="preserve">4.1b 1 </w:t>
+      </w:r>
+      <w:proofErr w:type="spellStart"/>
+      <w:r>
+        <w:rPr>
+          <w:lang w:val="en-GB"/>
+        </w:rPr>
+        <w:t>keer</w:t>
+      </w:r>
+      <w:proofErr w:type="spellEnd"/>
+      <w:r>
+        <w:rPr>
+          <w:lang w:val="en-GB"/>
+        </w:rPr>
+        <w:t xml:space="preserve"> </w:t>
+      </w:r>
+      <w:proofErr w:type="spellStart"/>
+      <w:r>
+        <w:rPr>
+          <w:lang w:val="en-GB"/>
+        </w:rPr>
+        <w:t>bla</w:t>
+      </w:r>
+      <w:proofErr w:type="spellEnd"/>
+      <w:r>
+        <w:rPr>
+          <w:lang w:val="en-GB"/>
+        </w:rPr>
+        <w:t>…</w:t>
+      </w:r>
+    </w:p>
+    <w:p>
+      <w:pPr>
+        <w:rPr>
+          <w:lang w:val="nl-NL"/>
+        </w:rPr>
+      </w:pPr>
+      <w:r>
+        <w:rPr>
+          <w:lang w:val="nl-NL"/>
+        </w:rPr>
+        <w:t xml:space="preserve">4.2a </w:t>
+      </w:r>
+      <w:r>
+        <w:rPr>
+          <w:lang w:val="nl-NL"/>
+        </w:rPr>
+        <w:t xml:space="preserve">nog een keer </w:t>
+      </w:r>
+      <w:proofErr w:type="spellStart"/>
+      <w:r>
+        <w:rPr>
+          <w:lang w:val="nl-NL"/>
+        </w:rPr>
+        <w:t>p</w:t>
+      </w:r>
+      <w:r>
+        <w:rPr>
+          <w:lang w:val="nl-NL"/>
+        </w:rPr>
+        <w:t>ouring</w:t>
+      </w:r>
+      <w:proofErr w:type="spellEnd"/>
+    </w:p>
+    <w:p>
+      <w:pPr>
+        <w:rPr>
+          <w:lang w:val="nl-NL"/>
+        </w:rPr>
+      </w:pPr>
+      <w:r>
+        <w:rPr>
+          <w:lang w:val="nl-NL"/>
+        </w:rPr>
+        <w:t xml:space="preserve">4.2b twee keer </w:t>
+      </w:r>
+      <w:proofErr w:type="spellStart"/>
+      <w:r>
+        <w:rPr>
+          <w:lang w:val="nl-NL"/>
+        </w:rPr>
+        <w:t>pouring</w:t>
+      </w:r>
+      <w:proofErr w:type="spellEnd"/>
+      <w:r>
+        <w:rPr>
+          <w:lang w:val="nl-NL"/>
+        </w:rPr>
+        <w:t xml:space="preserve"> en dan </w:t>
+      </w:r>
+      <w:proofErr w:type="spellStart"/>
+      <w:r>
+        <w:rPr>
+          <w:lang w:val="nl-NL"/>
+        </w:rPr>
+        <w:t>You’re</w:t>
+      </w:r>
+      <w:proofErr w:type="spellEnd"/>
+      <w:r>
+        <w:rPr>
+          <w:lang w:val="nl-NL"/>
+        </w:rPr>
+        <w:t xml:space="preserve"> </w:t>
+      </w:r>
+      <w:proofErr w:type="spellStart"/>
+      <w:r>
+        <w:rPr>
+          <w:lang w:val="nl-NL"/>
+        </w:rPr>
+        <w:t>welcome</w:t>
+      </w:r>
+      <w:proofErr w:type="spellEnd"/>
+      <w:r>
+        <w:rPr>
+          <w:lang w:val="nl-NL"/>
+        </w:rPr>
+        <w:t>!</w:t>
+      </w:r>
+    </w:p>
+    <w:p>
+      <w:pPr>
+        <w:rPr>
+          <w:lang w:val="en-US"/>
+        </w:rPr>
+      </w:pPr>
+      <w:r>
+        <w:rPr>
+          <w:lang w:val="en-US"/>
+        </w:rPr>
+        <w:t xml:space="preserve">4.3a 5 ticks left, </w:t>
+      </w:r>
+      <w:r>
+        <w:rPr>
+          <w:lang w:val="en-US"/>
+        </w:rPr>
+        <w:t>4…</w:t>
+      </w:r>
+      <w:r>
+        <w:rPr>
+          <w:lang w:val="en-US"/>
+        </w:rPr>
+        <w:t>0</w:t>
+      </w:r>
+      <w:r>
+        <w:rPr>
+          <w:lang w:val="en-US"/>
+        </w:rPr>
+        <w:t xml:space="preserve"> ticks le</w:t>
+      </w:r>
+      <w:r>
+        <w:rPr>
+          <w:lang w:val="en-US"/>
+        </w:rPr>
+        <w:t>ft – done</w:t>
+      </w:r>
+      <w:r>
+        <w:rPr>
+          <w:lang w:val="en-US"/>
+        </w:rPr>
+        <w:t>!</w:t>
+      </w:r>
+    </w:p>
+    <w:p>
+      <w:pPr>
+        <w:rPr>
+          <w:lang w:val="en-US"/>
+        </w:rPr>
+      </w:pPr>
+      <w:r>
+        <w:rPr>
+          <w:lang w:val="en-US"/>
+        </w:rPr>
+        <w:t xml:space="preserve">4.3.b </w:t>
+      </w:r>
+      <w:r>
+        <w:rPr>
+          <w:lang w:val="en-US"/>
+        </w:rPr>
+        <w:t>0 ticks left – done!</w:t>
+      </w:r>
+    </w:p>
+    <w:p>
+      <w:pPr>
+        <w:rPr>
+          <w:lang w:val="en-US"/>
+        </w:rPr>
+      </w:pPr>
+      <w:r>
+        <w:rPr>
+          <w:lang w:val="en-US"/>
+        </w:rPr>
+        <w:t>4.3</w:t>
+      </w:r>
+      <w:r>
+        <w:rPr>
+          <w:lang w:val="en-US"/>
+        </w:rPr>
+        <w:t>c -ticks left -done!</w:t>
+      </w:r>
+    </w:p>
+    <w:p>
+      <w:pPr>
+        <w:rPr>
+          <w:lang w:val="en-US"/>
+        </w:rPr>
+      </w:pPr>
+      <w:r>
+        <w:rPr>
+          <w:lang w:val="en-US"/>
+        </w:rPr>
+        <w:t>4.4</w:t>
+      </w:r>
+      <w:r>
+        <w:rPr>
+          <w:lang w:val="en-US"/>
+        </w:rPr>
+        <w:t>a 5 lines</w:t>
+      </w:r>
+    </w:p>
+    <w:p>
+      <w:pPr>
+        <w:rPr>
+          <w:lang w:val="en-US"/>
+        </w:rPr>
+      </w:pPr>
+      <w:r>
+        <w:rPr>
+          <w:lang w:val="en-US"/>
+        </w:rPr>
+        <w:t xml:space="preserve">4.4b </w:t>
+      </w:r>
+      <w:r>
+        <w:rPr>
+          <w:lang w:val="en-US"/>
+        </w:rPr>
+        <w:t>no output</w:t>
+      </w:r>
+    </w:p>
+    <w:p>
+      <w:pPr>
+        <w:rPr>
+          <w:lang w:val="en-US"/>
+        </w:rPr>
+      </w:pPr>
+      <w:r>
+        <w:rPr>
+          <w:lang w:val="en-US"/>
+        </w:rPr>
+        <w:t>4.4c 4 lines</w:t>
+      </w:r>
+    </w:p>
+    <w:p>
+      <w:pPr>
+        <w:rPr>
+          <w:lang w:val="en-US"/>
+        </w:rPr>
+      </w:pPr>
+      <w:r>
+        <w:rPr>
+          <w:lang w:val="en-US"/>
+        </w:rPr>
+        <w:t>4.4d NO lines!!!</w:t>
+      </w:r>
+    </w:p>
+    <w:p>
+      <w:pPr>
+        <w:rPr>
+          <w:lang w:val="en-US"/>
+        </w:rPr>
+      </w:pPr>
+      <w:r>
+        <w:rPr>
+          <w:lang w:val="en-US"/>
+        </w:rPr>
+        <w:lastRenderedPageBreak/>
+        <w:t>4.4e 3 lines</w:t>
+      </w:r>
+    </w:p>
+    <w:p>
+      <w:pPr>
+        <w:rPr>
+          <w:lang w:val="en-US"/>
+        </w:rPr>
+      </w:pPr>
+      <w:r>
+        <w:rPr>
+          <w:lang w:val="en-US"/>
+        </w:rPr>
+        <w:t>4.4f 3 lines</w:t>
+      </w:r>
+    </w:p>
+    <w:p>
+      <w:pPr>
+        <w:rPr>
+          <w:lang w:val="nl-NL"/>
+        </w:rPr>
+      </w:pPr>
+      <w:r>
+        <w:rPr>
+          <w:lang w:val="nl-NL"/>
+        </w:rPr>
+        <w:t>Rest gekeken in de c</w:t>
+      </w:r>
+      <w:r>
+        <w:rPr>
+          <w:lang w:val="nl-NL"/>
+        </w:rPr>
+        <w:t>ode</w:t>
+      </w:r>
+    </w:p>
+    <w:p>
+      <w:pPr>
+        <w:rPr>
+          <w:lang w:val="nl-NL"/>
+        </w:rPr>
+      </w:pPr>
+    </w:p>
+    <w:p>
+      <w:pPr>
+        <w:rPr>
+          <w:lang w:val="nl-NL"/>
+        </w:rPr>
+      </w:pPr>
+    </w:p>
+    <w:p>
+      <w:pPr>
+        <w:rPr>
+          <w:lang w:val="nl-NL"/>
+        </w:rPr>
+      </w:pPr>
+    </w:p>
+    <w:p>
+      <w:pPr>
+        <w:rPr>
+          <w:lang w:val="nl-NL"/>
+        </w:rPr>
+      </w:pPr>
+    </w:p>
+    <w:p>
+      <w:pPr>
+        <w:rPr>
+          <w:lang w:val="nl-NL"/>
+        </w:rPr>
+      </w:pPr>
+    </w:p>
+    <w:p>
+      <w:pPr>
+        <w:rPr>
+          <w:lang w:val="nl-NL"/>
+        </w:rPr>
+      </w:pPr>
+    </w:p>
+    <w:p>
+      <w:pPr>
+        <w:rPr>
+          <w:lang w:val="nl-NL"/>
+        </w:rPr>
+      </w:pPr>
+    </w:p>
+    <w:p>
+      <w:pPr>
+        <w:rPr>
+          <w:lang w:val="nl-NL"/>
         </w:rPr>
       </w:pPr>
     </w:p>
@@ -2183,7 +2583,7 @@
       <w:pPr>
         <w:ind w:left="360"/>
         <w:rPr>
-          <w:lang w:val="en-GB"/>
+          <w:lang w:val="nl-NL"/>
         </w:rPr>
       </w:pPr>
     </w:p>
@@ -2191,14 +2591,14 @@
       <w:pPr>
         <w:ind w:left="360"/>
         <w:rPr>
-          <w:lang w:val="en-GB"/>
-        </w:rPr>
-      </w:pPr>
-    </w:p>
-    <w:p>
-      <w:pPr>
-        <w:rPr>
-          <w:lang w:val="en-GB"/>
+          <w:lang w:val="nl-NL"/>
+        </w:rPr>
+      </w:pPr>
+    </w:p>
+    <w:p>
+      <w:pPr>
+        <w:rPr>
+          <w:lang w:val="nl-NL"/>
         </w:rPr>
       </w:pPr>
     </w:p>

</xml_diff>